<commit_message>
Fixed outdated/bad comments and updated debug log with evidence and an explanation
</commit_message>
<xml_diff>
--- a/Testing Table.docx
+++ b/Testing Table.docx
@@ -3320,17 +3320,66 @@
           <w:bCs/>
         </w:rPr>
       </w:pPr>
+    </w:p>
+    <w:p>
+      <w:pPr>
+        <w:rPr>
+          <w:b/>
+          <w:bCs/>
+        </w:rPr>
+      </w:pPr>
+    </w:p>
+    <w:p>
+      <w:pPr>
+        <w:rPr>
+          <w:b/>
+          <w:bCs/>
+        </w:rPr>
+      </w:pPr>
+    </w:p>
+    <w:p>
+      <w:pPr>
+        <w:rPr>
+          <w:b/>
+          <w:bCs/>
+        </w:rPr>
+      </w:pPr>
+    </w:p>
+    <w:p>
+      <w:pPr>
+        <w:rPr>
+          <w:b/>
+          <w:bCs/>
+        </w:rPr>
+      </w:pPr>
+    </w:p>
+    <w:p>
+      <w:pPr>
+        <w:rPr>
+          <w:b/>
+          <w:bCs/>
+        </w:rPr>
+      </w:pPr>
+    </w:p>
+    <w:p>
+      <w:pPr>
+        <w:rPr>
+          <w:b/>
+          <w:bCs/>
+        </w:rPr>
+      </w:pPr>
       <w:r>
         <w:rPr>
           <w:b/>
           <w:bCs/>
         </w:rPr>
+        <w:lastRenderedPageBreak/>
         <w:t>Debugging / Fix Log</w:t>
       </w:r>
     </w:p>
     <w:tbl>
       <w:tblPr>
-        <w:tblW w:w="9360" w:type="dxa"/>
+        <w:tblW w:w="9177" w:type="dxa"/>
         <w:tblBorders>
           <w:top w:val="single" w:sz="4" w:space="0" w:color="auto"/>
           <w:left w:val="single" w:sz="4" w:space="0" w:color="auto"/>
@@ -3339,6 +3388,7 @@
           <w:insideH w:val="single" w:sz="4" w:space="0" w:color="auto"/>
           <w:insideV w:val="single" w:sz="4" w:space="0" w:color="auto"/>
         </w:tblBorders>
+        <w:tblLayout w:type="fixed"/>
         <w:tblCellMar>
           <w:left w:w="10" w:type="dxa"/>
           <w:right w:w="10" w:type="dxa"/>
@@ -3346,17 +3396,19 @@
         <w:tblLook w:val="04A0" w:firstRow="1" w:lastRow="0" w:firstColumn="1" w:lastColumn="0" w:noHBand="0" w:noVBand="1"/>
       </w:tblPr>
       <w:tblGrid>
-        <w:gridCol w:w="3000"/>
-        <w:gridCol w:w="3000"/>
-        <w:gridCol w:w="3360"/>
+        <w:gridCol w:w="1248"/>
+        <w:gridCol w:w="1379"/>
+        <w:gridCol w:w="2140"/>
+        <w:gridCol w:w="4410"/>
       </w:tblGrid>
       <w:tr>
         <w:trPr>
+          <w:trHeight w:val="374"/>
           <w:tblHeader/>
         </w:trPr>
         <w:tc>
           <w:tcPr>
-            <w:tcW w:w="3000" w:type="dxa"/>
+            <w:tcW w:w="1248" w:type="dxa"/>
             <w:tcBorders>
               <w:top w:val="single" w:sz="2" w:space="0" w:color="CCCCCC"/>
               <w:left w:val="single" w:sz="2" w:space="0" w:color="CCCCCC"/>
@@ -3385,7 +3437,7 @@
         </w:tc>
         <w:tc>
           <w:tcPr>
-            <w:tcW w:w="3000" w:type="dxa"/>
+            <w:tcW w:w="1379" w:type="dxa"/>
             <w:tcBorders>
               <w:top w:val="single" w:sz="2" w:space="0" w:color="CCCCCC"/>
               <w:left w:val="single" w:sz="2" w:space="0" w:color="CCCCCC"/>
@@ -3414,7 +3466,7 @@
         </w:tc>
         <w:tc>
           <w:tcPr>
-            <w:tcW w:w="3360" w:type="dxa"/>
+            <w:tcW w:w="2140" w:type="dxa"/>
             <w:tcBorders>
               <w:top w:val="single" w:sz="2" w:space="0" w:color="CCCCCC"/>
               <w:left w:val="single" w:sz="2" w:space="0" w:color="CCCCCC"/>
@@ -3441,11 +3493,42 @@
             </w:r>
           </w:p>
         </w:tc>
+        <w:tc>
+          <w:tcPr>
+            <w:tcW w:w="4410" w:type="dxa"/>
+            <w:tcBorders>
+              <w:top w:val="single" w:sz="2" w:space="0" w:color="CCCCCC"/>
+              <w:left w:val="single" w:sz="2" w:space="0" w:color="CCCCCC"/>
+              <w:bottom w:val="single" w:sz="2" w:space="0" w:color="CCCCCC"/>
+              <w:right w:val="single" w:sz="2" w:space="0" w:color="CCCCCC"/>
+            </w:tcBorders>
+            <w:shd w:val="clear" w:color="auto" w:fill="FFFFFF"/>
+            <w:vAlign w:val="center"/>
+          </w:tcPr>
+          <w:p>
+            <w:pPr>
+              <w:rPr>
+                <w:b/>
+                <w:bCs/>
+              </w:rPr>
+            </w:pPr>
+            <w:r>
+              <w:rPr>
+                <w:b/>
+                <w:bCs/>
+              </w:rPr>
+              <w:t>Evidence</w:t>
+            </w:r>
+          </w:p>
+        </w:tc>
       </w:tr>
       <w:tr>
-        <w:tc>
-          <w:tcPr>
-            <w:tcW w:w="3000" w:type="dxa"/>
+        <w:trPr>
+          <w:trHeight w:val="2507"/>
+        </w:trPr>
+        <w:tc>
+          <w:tcPr>
+            <w:tcW w:w="1248" w:type="dxa"/>
             <w:tcBorders>
               <w:top w:val="single" w:sz="2" w:space="0" w:color="CCCCCC"/>
               <w:left w:val="single" w:sz="2" w:space="0" w:color="CCCCCC"/>
@@ -3470,7 +3553,7 @@
         </w:tc>
         <w:tc>
           <w:tcPr>
-            <w:tcW w:w="3000" w:type="dxa"/>
+            <w:tcW w:w="1379" w:type="dxa"/>
             <w:tcBorders>
               <w:top w:val="single" w:sz="2" w:space="0" w:color="CCCCCC"/>
               <w:left w:val="single" w:sz="2" w:space="0" w:color="CCCCCC"/>
@@ -3500,7 +3583,7 @@
         </w:tc>
         <w:tc>
           <w:tcPr>
-            <w:tcW w:w="3360" w:type="dxa"/>
+            <w:tcW w:w="2140" w:type="dxa"/>
             <w:tcBorders>
               <w:top w:val="single" w:sz="2" w:space="0" w:color="CCCCCC"/>
               <w:left w:val="single" w:sz="2" w:space="0" w:color="CCCCCC"/>
@@ -3533,37 +3616,177 @@
             </w:r>
           </w:p>
         </w:tc>
+        <w:tc>
+          <w:tcPr>
+            <w:tcW w:w="4410" w:type="dxa"/>
+            <w:tcBorders>
+              <w:top w:val="single" w:sz="2" w:space="0" w:color="CCCCCC"/>
+              <w:left w:val="single" w:sz="2" w:space="0" w:color="CCCCCC"/>
+              <w:bottom w:val="single" w:sz="2" w:space="0" w:color="CCCCCC"/>
+              <w:right w:val="single" w:sz="2" w:space="0" w:color="CCCCCC"/>
+            </w:tcBorders>
+            <w:shd w:val="clear" w:color="auto" w:fill="FFFFFF"/>
+          </w:tcPr>
+          <w:p>
+            <w:hyperlink r:id="rId4" w:history="1">
+              <w:r>
+                <w:rPr>
+                  <w:rStyle w:val="Hyperlink"/>
+                </w:rPr>
+                <w:t>https://github.com/rewan-h/2.7-91896-BikeShop/co</w:t>
+              </w:r>
+              <w:r>
+                <w:rPr>
+                  <w:rStyle w:val="Hyperlink"/>
+                </w:rPr>
+                <w:t>m</w:t>
+              </w:r>
+              <w:r>
+                <w:rPr>
+                  <w:rStyle w:val="Hyperlink"/>
+                </w:rPr>
+                <w:t>mit/a1f6403fbde3a38a62121450775e4c793566ba5e</w:t>
+              </w:r>
+            </w:hyperlink>
+          </w:p>
+          <w:p>
+            <w:r>
+              <w:drawing>
+                <wp:inline distT="0" distB="0" distL="0" distR="0" wp14:anchorId="696E6EB8" wp14:editId="4C9A8094">
+                  <wp:extent cx="2787650" cy="972820"/>
+                  <wp:effectExtent l="0" t="0" r="0" b="0"/>
+                  <wp:docPr id="39631429" name="Picture 1"/>
+                  <wp:cNvGraphicFramePr>
+                    <a:graphicFrameLocks xmlns:a="http://schemas.openxmlformats.org/drawingml/2006/main" noChangeAspect="1"/>
+                  </wp:cNvGraphicFramePr>
+                  <a:graphic xmlns:a="http://schemas.openxmlformats.org/drawingml/2006/main">
+                    <a:graphicData uri="http://schemas.openxmlformats.org/drawingml/2006/picture">
+                      <pic:pic xmlns:pic="http://schemas.openxmlformats.org/drawingml/2006/picture">
+                        <pic:nvPicPr>
+                          <pic:cNvPr id="39631429" name=""/>
+                          <pic:cNvPicPr/>
+                        </pic:nvPicPr>
+                        <pic:blipFill>
+                          <a:blip r:embed="rId5"/>
+                          <a:stretch>
+                            <a:fillRect/>
+                          </a:stretch>
+                        </pic:blipFill>
+                        <pic:spPr>
+                          <a:xfrm>
+                            <a:off x="0" y="0"/>
+                            <a:ext cx="2787650" cy="972820"/>
+                          </a:xfrm>
+                          <a:prstGeom prst="rect">
+                            <a:avLst/>
+                          </a:prstGeom>
+                        </pic:spPr>
+                      </pic:pic>
+                    </a:graphicData>
+                  </a:graphic>
+                </wp:inline>
+              </w:drawing>
+            </w:r>
+          </w:p>
+          <w:p>
+            <w:r>
+              <w:drawing>
+                <wp:inline distT="0" distB="0" distL="0" distR="0" wp14:anchorId="6A7ACF7B" wp14:editId="0476948D">
+                  <wp:extent cx="2787650" cy="478155"/>
+                  <wp:effectExtent l="0" t="0" r="0" b="0"/>
+                  <wp:docPr id="1883209158" name="Picture 1"/>
+                  <wp:cNvGraphicFramePr>
+                    <a:graphicFrameLocks xmlns:a="http://schemas.openxmlformats.org/drawingml/2006/main" noChangeAspect="1"/>
+                  </wp:cNvGraphicFramePr>
+                  <a:graphic xmlns:a="http://schemas.openxmlformats.org/drawingml/2006/main">
+                    <a:graphicData uri="http://schemas.openxmlformats.org/drawingml/2006/picture">
+                      <pic:pic xmlns:pic="http://schemas.openxmlformats.org/drawingml/2006/picture">
+                        <pic:nvPicPr>
+                          <pic:cNvPr id="1883209158" name=""/>
+                          <pic:cNvPicPr/>
+                        </pic:nvPicPr>
+                        <pic:blipFill>
+                          <a:blip r:embed="rId6"/>
+                          <a:stretch>
+                            <a:fillRect/>
+                          </a:stretch>
+                        </pic:blipFill>
+                        <pic:spPr>
+                          <a:xfrm>
+                            <a:off x="0" y="0"/>
+                            <a:ext cx="2787650" cy="478155"/>
+                          </a:xfrm>
+                          <a:prstGeom prst="rect">
+                            <a:avLst/>
+                          </a:prstGeom>
+                        </pic:spPr>
+                      </pic:pic>
+                    </a:graphicData>
+                  </a:graphic>
+                </wp:inline>
+              </w:drawing>
+            </w:r>
+          </w:p>
+          <w:p>
+            <w:r>
+              <w:t xml:space="preserve">On Line 14 of main.py we just cast </w:t>
+            </w:r>
+            <w:proofErr w:type="gramStart"/>
+            <w:r>
+              <w:t>int(</w:t>
+            </w:r>
+            <w:proofErr w:type="gramEnd"/>
+            <w:r>
+              <w:t xml:space="preserve">) in the rental class </w:t>
+            </w:r>
+            <w:proofErr w:type="spellStart"/>
+            <w:r>
+              <w:t>init</w:t>
+            </w:r>
+            <w:proofErr w:type="spellEnd"/>
+            <w:r>
+              <w:t xml:space="preserve"> function without any checks. The bug won’t occur on this version as it was temporarily patched with try/except before I pushed the </w:t>
+            </w:r>
+            <w:proofErr w:type="gramStart"/>
+            <w:r>
+              <w:t>commit</w:t>
+            </w:r>
+            <w:proofErr w:type="gramEnd"/>
+            <w:r>
+              <w:t>.</w:t>
+            </w:r>
+          </w:p>
+        </w:tc>
       </w:tr>
       <w:tr>
         <w:tc>
           <w:tcPr>
-            <w:tcW w:w="3000" w:type="dxa"/>
-            <w:tcBorders>
-              <w:top w:val="single" w:sz="2" w:space="0" w:color="CCCCCC"/>
-              <w:left w:val="single" w:sz="2" w:space="0" w:color="CCCCCC"/>
-              <w:bottom w:val="single" w:sz="2" w:space="0" w:color="CCCCCC"/>
-              <w:right w:val="single" w:sz="2" w:space="0" w:color="CCCCCC"/>
-            </w:tcBorders>
-            <w:shd w:val="clear" w:color="auto" w:fill="FFFFFF"/>
-            <w:tcMar>
-              <w:top w:w="80" w:type="dxa"/>
-              <w:left w:w="120" w:type="dxa"/>
-              <w:bottom w:w="80" w:type="dxa"/>
-              <w:right w:w="120" w:type="dxa"/>
-            </w:tcMar>
-            <w:vAlign w:val="center"/>
-            <w:hideMark/>
-          </w:tcPr>
-          <w:p>
-            <w:r>
-              <w:lastRenderedPageBreak/>
+            <w:tcW w:w="1248" w:type="dxa"/>
+            <w:tcBorders>
+              <w:top w:val="single" w:sz="2" w:space="0" w:color="CCCCCC"/>
+              <w:left w:val="single" w:sz="2" w:space="0" w:color="CCCCCC"/>
+              <w:bottom w:val="single" w:sz="2" w:space="0" w:color="CCCCCC"/>
+              <w:right w:val="single" w:sz="2" w:space="0" w:color="CCCCCC"/>
+            </w:tcBorders>
+            <w:shd w:val="clear" w:color="auto" w:fill="FFFFFF"/>
+            <w:tcMar>
+              <w:top w:w="80" w:type="dxa"/>
+              <w:left w:w="120" w:type="dxa"/>
+              <w:bottom w:w="80" w:type="dxa"/>
+              <w:right w:w="120" w:type="dxa"/>
+            </w:tcMar>
+            <w:vAlign w:val="center"/>
+            <w:hideMark/>
+          </w:tcPr>
+          <w:p>
+            <w:r>
               <w:t>Empty name gave wrong error message</w:t>
             </w:r>
           </w:p>
         </w:tc>
         <w:tc>
           <w:tcPr>
-            <w:tcW w:w="3000" w:type="dxa"/>
+            <w:tcW w:w="1379" w:type="dxa"/>
             <w:tcBorders>
               <w:top w:val="single" w:sz="2" w:space="0" w:color="CCCCCC"/>
               <w:left w:val="single" w:sz="2" w:space="0" w:color="CCCCCC"/>
@@ -3588,7 +3811,7 @@
         </w:tc>
         <w:tc>
           <w:tcPr>
-            <w:tcW w:w="3360" w:type="dxa"/>
+            <w:tcW w:w="2140" w:type="dxa"/>
             <w:tcBorders>
               <w:top w:val="single" w:sz="2" w:space="0" w:color="CCCCCC"/>
               <w:left w:val="single" w:sz="2" w:space="0" w:color="CCCCCC"/>
@@ -3621,11 +3844,80 @@
             </w:r>
           </w:p>
         </w:tc>
+        <w:tc>
+          <w:tcPr>
+            <w:tcW w:w="4410" w:type="dxa"/>
+            <w:tcBorders>
+              <w:top w:val="single" w:sz="2" w:space="0" w:color="CCCCCC"/>
+              <w:left w:val="single" w:sz="2" w:space="0" w:color="CCCCCC"/>
+              <w:bottom w:val="single" w:sz="2" w:space="0" w:color="CCCCCC"/>
+              <w:right w:val="single" w:sz="2" w:space="0" w:color="CCCCCC"/>
+            </w:tcBorders>
+            <w:shd w:val="clear" w:color="auto" w:fill="FFFFFF"/>
+          </w:tcPr>
+          <w:p>
+            <w:r>
+              <w:drawing>
+                <wp:inline distT="0" distB="0" distL="0" distR="0" wp14:anchorId="6880175C" wp14:editId="150D08E7">
+                  <wp:extent cx="2787650" cy="1025525"/>
+                  <wp:effectExtent l="0" t="0" r="0" b="3175"/>
+                  <wp:docPr id="1979053823" name="Picture 1"/>
+                  <wp:cNvGraphicFramePr>
+                    <a:graphicFrameLocks xmlns:a="http://schemas.openxmlformats.org/drawingml/2006/main" noChangeAspect="1"/>
+                  </wp:cNvGraphicFramePr>
+                  <a:graphic xmlns:a="http://schemas.openxmlformats.org/drawingml/2006/main">
+                    <a:graphicData uri="http://schemas.openxmlformats.org/drawingml/2006/picture">
+                      <pic:pic xmlns:pic="http://schemas.openxmlformats.org/drawingml/2006/picture">
+                        <pic:nvPicPr>
+                          <pic:cNvPr id="1979053823" name=""/>
+                          <pic:cNvPicPr/>
+                        </pic:nvPicPr>
+                        <pic:blipFill>
+                          <a:blip r:embed="rId7"/>
+                          <a:stretch>
+                            <a:fillRect/>
+                          </a:stretch>
+                        </pic:blipFill>
+                        <pic:spPr>
+                          <a:xfrm>
+                            <a:off x="0" y="0"/>
+                            <a:ext cx="2787650" cy="1025525"/>
+                          </a:xfrm>
+                          <a:prstGeom prst="rect">
+                            <a:avLst/>
+                          </a:prstGeom>
+                        </pic:spPr>
+                      </pic:pic>
+                    </a:graphicData>
+                  </a:graphic>
+                </wp:inline>
+              </w:drawing>
+            </w:r>
+          </w:p>
+          <w:p>
+            <w:r>
+              <w:t xml:space="preserve">Before the above check was added if name contained nothing or just whitespace </w:t>
+            </w:r>
+            <w:proofErr w:type="gramStart"/>
+            <w:r>
+              <w:t>characters .</w:t>
+            </w:r>
+            <w:proofErr w:type="spellStart"/>
+            <w:r>
+              <w:t>isalpha</w:t>
+            </w:r>
+            <w:proofErr w:type="spellEnd"/>
+            <w:proofErr w:type="gramEnd"/>
+            <w:r>
+              <w:t>() would return false as it does for empty strings causing a misleading error message</w:t>
+            </w:r>
+          </w:p>
+        </w:tc>
       </w:tr>
       <w:tr>
         <w:tc>
           <w:tcPr>
-            <w:tcW w:w="3000" w:type="dxa"/>
+            <w:tcW w:w="1248" w:type="dxa"/>
             <w:tcBorders>
               <w:top w:val="single" w:sz="2" w:space="0" w:color="CCCCCC"/>
               <w:left w:val="single" w:sz="2" w:space="0" w:color="CCCCCC"/>
@@ -3650,7 +3942,7 @@
         </w:tc>
         <w:tc>
           <w:tcPr>
-            <w:tcW w:w="3000" w:type="dxa"/>
+            <w:tcW w:w="1379" w:type="dxa"/>
             <w:tcBorders>
               <w:top w:val="single" w:sz="2" w:space="0" w:color="CCCCCC"/>
               <w:left w:val="single" w:sz="2" w:space="0" w:color="CCCCCC"/>
@@ -3675,7 +3967,7 @@
         </w:tc>
         <w:tc>
           <w:tcPr>
-            <w:tcW w:w="3360" w:type="dxa"/>
+            <w:tcW w:w="2140" w:type="dxa"/>
             <w:tcBorders>
               <w:top w:val="single" w:sz="2" w:space="0" w:color="CCCCCC"/>
               <w:left w:val="single" w:sz="2" w:space="0" w:color="CCCCCC"/>
@@ -3696,13 +3988,91 @@
             <w:r>
               <w:t>Added check for empty selection</w:t>
             </w:r>
+          </w:p>
+        </w:tc>
+        <w:tc>
+          <w:tcPr>
+            <w:tcW w:w="4410" w:type="dxa"/>
+            <w:tcBorders>
+              <w:top w:val="single" w:sz="2" w:space="0" w:color="CCCCCC"/>
+              <w:left w:val="single" w:sz="2" w:space="0" w:color="CCCCCC"/>
+              <w:bottom w:val="single" w:sz="2" w:space="0" w:color="CCCCCC"/>
+              <w:right w:val="single" w:sz="2" w:space="0" w:color="CCCCCC"/>
+            </w:tcBorders>
+            <w:shd w:val="clear" w:color="auto" w:fill="FFFFFF"/>
+          </w:tcPr>
+          <w:p>
+            <w:r>
+              <w:drawing>
+                <wp:inline distT="0" distB="0" distL="0" distR="0" wp14:anchorId="02CB5FB4" wp14:editId="4F2323F4">
+                  <wp:extent cx="2787650" cy="762635"/>
+                  <wp:effectExtent l="0" t="0" r="0" b="0"/>
+                  <wp:docPr id="293971288" name="Picture 1"/>
+                  <wp:cNvGraphicFramePr>
+                    <a:graphicFrameLocks xmlns:a="http://schemas.openxmlformats.org/drawingml/2006/main" noChangeAspect="1"/>
+                  </wp:cNvGraphicFramePr>
+                  <a:graphic xmlns:a="http://schemas.openxmlformats.org/drawingml/2006/main">
+                    <a:graphicData uri="http://schemas.openxmlformats.org/drawingml/2006/picture">
+                      <pic:pic xmlns:pic="http://schemas.openxmlformats.org/drawingml/2006/picture">
+                        <pic:nvPicPr>
+                          <pic:cNvPr id="293971288" name=""/>
+                          <pic:cNvPicPr/>
+                        </pic:nvPicPr>
+                        <pic:blipFill>
+                          <a:blip r:embed="rId8"/>
+                          <a:stretch>
+                            <a:fillRect/>
+                          </a:stretch>
+                        </pic:blipFill>
+                        <pic:spPr>
+                          <a:xfrm>
+                            <a:off x="0" y="0"/>
+                            <a:ext cx="2787650" cy="762635"/>
+                          </a:xfrm>
+                          <a:prstGeom prst="rect">
+                            <a:avLst/>
+                          </a:prstGeom>
+                        </pic:spPr>
+                      </pic:pic>
+                    </a:graphicData>
+                  </a:graphic>
+                </wp:inline>
+              </w:drawing>
+            </w:r>
+          </w:p>
+          <w:p>
+            <w:r>
+              <w:lastRenderedPageBreak/>
+              <w:t xml:space="preserve">Before this was added </w:t>
+            </w:r>
+            <w:proofErr w:type="spellStart"/>
+            <w:r>
+              <w:t>bikeType</w:t>
+            </w:r>
+            <w:proofErr w:type="spellEnd"/>
+            <w:r>
+              <w:t xml:space="preserve"> wasn’t checked for as I assumed that the user would always click an option. This was fixed with the above code (Note that I didn’t </w:t>
+            </w:r>
+            <w:proofErr w:type="gramStart"/>
+            <w:r>
+              <w:t>use .strip</w:t>
+            </w:r>
+            <w:proofErr w:type="gramEnd"/>
+            <w:r>
+              <w:t xml:space="preserve">() as the user is unable to input whitespace characters as the dropdown is made with a state of </w:t>
+            </w:r>
+            <w:proofErr w:type="spellStart"/>
+            <w:r>
+              <w:t>readonly</w:t>
+            </w:r>
+            <w:proofErr w:type="spellEnd"/>
           </w:p>
         </w:tc>
       </w:tr>
       <w:tr>
         <w:tc>
           <w:tcPr>
-            <w:tcW w:w="3000" w:type="dxa"/>
+            <w:tcW w:w="1248" w:type="dxa"/>
             <w:tcBorders>
               <w:top w:val="single" w:sz="2" w:space="0" w:color="CCCCCC"/>
               <w:left w:val="single" w:sz="2" w:space="0" w:color="CCCCCC"/>
@@ -3722,6 +4092,7 @@
           <w:p>
             <w:proofErr w:type="spellStart"/>
             <w:r>
+              <w:lastRenderedPageBreak/>
               <w:t>Treeview</w:t>
             </w:r>
             <w:proofErr w:type="spellEnd"/>
@@ -3737,7 +4108,7 @@
         </w:tc>
         <w:tc>
           <w:tcPr>
-            <w:tcW w:w="3000" w:type="dxa"/>
+            <w:tcW w:w="1379" w:type="dxa"/>
             <w:tcBorders>
               <w:top w:val="single" w:sz="2" w:space="0" w:color="CCCCCC"/>
               <w:left w:val="single" w:sz="2" w:space="0" w:color="CCCCCC"/>
@@ -3762,7 +4133,7 @@
         </w:tc>
         <w:tc>
           <w:tcPr>
-            <w:tcW w:w="3360" w:type="dxa"/>
+            <w:tcW w:w="2140" w:type="dxa"/>
             <w:tcBorders>
               <w:top w:val="single" w:sz="2" w:space="0" w:color="CCCCCC"/>
               <w:left w:val="single" w:sz="2" w:space="0" w:color="CCCCCC"/>
@@ -3782,6 +4153,123 @@
           <w:p>
             <w:r>
               <w:t>Compared tuple values before removing</w:t>
+            </w:r>
+            <w:r>
+              <w:t xml:space="preserve"> and switched from return to break</w:t>
+            </w:r>
+          </w:p>
+        </w:tc>
+        <w:tc>
+          <w:tcPr>
+            <w:tcW w:w="4410" w:type="dxa"/>
+            <w:tcBorders>
+              <w:top w:val="single" w:sz="2" w:space="0" w:color="CCCCCC"/>
+              <w:left w:val="single" w:sz="2" w:space="0" w:color="CCCCCC"/>
+              <w:bottom w:val="single" w:sz="2" w:space="0" w:color="CCCCCC"/>
+              <w:right w:val="single" w:sz="2" w:space="0" w:color="CCCCCC"/>
+            </w:tcBorders>
+            <w:shd w:val="clear" w:color="auto" w:fill="FFFFFF"/>
+          </w:tcPr>
+          <w:p>
+            <w:r>
+              <w:drawing>
+                <wp:inline distT="0" distB="0" distL="0" distR="0" wp14:anchorId="5E863FFE" wp14:editId="0B0B685A">
+                  <wp:extent cx="1973580" cy="2227583"/>
+                  <wp:effectExtent l="0" t="0" r="7620" b="1270"/>
+                  <wp:docPr id="938587078" name="Picture 1"/>
+                  <wp:cNvGraphicFramePr>
+                    <a:graphicFrameLocks xmlns:a="http://schemas.openxmlformats.org/drawingml/2006/main" noChangeAspect="1"/>
+                  </wp:cNvGraphicFramePr>
+                  <a:graphic xmlns:a="http://schemas.openxmlformats.org/drawingml/2006/main">
+                    <a:graphicData uri="http://schemas.openxmlformats.org/drawingml/2006/picture">
+                      <pic:pic xmlns:pic="http://schemas.openxmlformats.org/drawingml/2006/picture">
+                        <pic:nvPicPr>
+                          <pic:cNvPr id="938587078" name=""/>
+                          <pic:cNvPicPr/>
+                        </pic:nvPicPr>
+                        <pic:blipFill>
+                          <a:blip r:embed="rId9"/>
+                          <a:stretch>
+                            <a:fillRect/>
+                          </a:stretch>
+                        </pic:blipFill>
+                        <pic:spPr>
+                          <a:xfrm>
+                            <a:off x="0" y="0"/>
+                            <a:ext cx="1977727" cy="2232264"/>
+                          </a:xfrm>
+                          <a:prstGeom prst="rect">
+                            <a:avLst/>
+                          </a:prstGeom>
+                        </pic:spPr>
+                      </pic:pic>
+                    </a:graphicData>
+                  </a:graphic>
+                </wp:inline>
+              </w:drawing>
+            </w:r>
+          </w:p>
+          <w:p>
+            <w:r>
+              <w:t xml:space="preserve">The tuple comparison </w:t>
+            </w:r>
+            <w:r>
+              <w:t xml:space="preserve">won’t show in version history as it was a bug I found and fixed in the same commit, but it took me a while to fix the return bug which essentially meant that items would be removed from the internal list but not the visible tree as return skipped over </w:t>
+            </w:r>
+            <w:proofErr w:type="spellStart"/>
+            <w:r>
+              <w:t>tree.delete</w:t>
+            </w:r>
+            <w:proofErr w:type="spellEnd"/>
+            <w:r>
+              <w:t xml:space="preserve">(item) I later switched to break which removed the bug as it allowed </w:t>
+            </w:r>
+            <w:proofErr w:type="spellStart"/>
+            <w:r>
+              <w:t>tree.delete</w:t>
+            </w:r>
+            <w:proofErr w:type="spellEnd"/>
+            <w:r>
+              <w:t xml:space="preserve"> to be ran</w:t>
+            </w:r>
+          </w:p>
+          <w:p>
+            <w:r>
+              <w:drawing>
+                <wp:inline distT="0" distB="0" distL="0" distR="0" wp14:anchorId="3A42F1A9" wp14:editId="2DC62947">
+                  <wp:extent cx="2766845" cy="1013460"/>
+                  <wp:effectExtent l="0" t="0" r="0" b="0"/>
+                  <wp:docPr id="1593032145" name="Picture 1"/>
+                  <wp:cNvGraphicFramePr>
+                    <a:graphicFrameLocks xmlns:a="http://schemas.openxmlformats.org/drawingml/2006/main" noChangeAspect="1"/>
+                  </wp:cNvGraphicFramePr>
+                  <a:graphic xmlns:a="http://schemas.openxmlformats.org/drawingml/2006/main">
+                    <a:graphicData uri="http://schemas.openxmlformats.org/drawingml/2006/picture">
+                      <pic:pic xmlns:pic="http://schemas.openxmlformats.org/drawingml/2006/picture">
+                        <pic:nvPicPr>
+                          <pic:cNvPr id="1593032145" name=""/>
+                          <pic:cNvPicPr/>
+                        </pic:nvPicPr>
+                        <pic:blipFill>
+                          <a:blip r:embed="rId10"/>
+                          <a:stretch>
+                            <a:fillRect/>
+                          </a:stretch>
+                        </pic:blipFill>
+                        <pic:spPr>
+                          <a:xfrm>
+                            <a:off x="0" y="0"/>
+                            <a:ext cx="2786784" cy="1020763"/>
+                          </a:xfrm>
+                          <a:prstGeom prst="rect">
+                            <a:avLst/>
+                          </a:prstGeom>
+                        </pic:spPr>
+                      </pic:pic>
+                    </a:graphicData>
+                  </a:graphic>
+                </wp:inline>
+              </w:drawing>
             </w:r>
           </w:p>
         </w:tc>
@@ -4402,6 +4890,7 @@
   <w:style w:type="character" w:default="1" w:styleId="DefaultParagraphFont">
     <w:name w:val="Default Paragraph Font"/>
     <w:uiPriority w:val="1"/>
+    <w:semiHidden/>
     <w:unhideWhenUsed/>
   </w:style>
   <w:style w:type="table" w:default="1" w:styleId="TableNormal">
@@ -4715,6 +5204,41 @@
       <w:spacing w:val="5"/>
     </w:rPr>
   </w:style>
+  <w:style w:type="character" w:styleId="Hyperlink">
+    <w:name w:val="Hyperlink"/>
+    <w:basedOn w:val="DefaultParagraphFont"/>
+    <w:uiPriority w:val="99"/>
+    <w:unhideWhenUsed/>
+    <w:rsid w:val="00B943A8"/>
+    <w:rPr>
+      <w:color w:val="467886" w:themeColor="hyperlink"/>
+      <w:u w:val="single"/>
+    </w:rPr>
+  </w:style>
+  <w:style w:type="character" w:styleId="UnresolvedMention">
+    <w:name w:val="Unresolved Mention"/>
+    <w:basedOn w:val="DefaultParagraphFont"/>
+    <w:uiPriority w:val="99"/>
+    <w:semiHidden/>
+    <w:unhideWhenUsed/>
+    <w:rsid w:val="00B943A8"/>
+    <w:rPr>
+      <w:color w:val="605E5C"/>
+      <w:shd w:val="clear" w:color="auto" w:fill="E1DFDD"/>
+    </w:rPr>
+  </w:style>
+  <w:style w:type="character" w:styleId="FollowedHyperlink">
+    <w:name w:val="FollowedHyperlink"/>
+    <w:basedOn w:val="DefaultParagraphFont"/>
+    <w:uiPriority w:val="99"/>
+    <w:semiHidden/>
+    <w:unhideWhenUsed/>
+    <w:rsid w:val="00B943A8"/>
+    <w:rPr>
+      <w:color w:val="96607D" w:themeColor="followedHyperlink"/>
+      <w:u w:val="single"/>
+    </w:rPr>
+  </w:style>
 </w:styles>
 </file>
 

</xml_diff>